<commit_message>
Fill US entity in footer and plans (Asia Lab Global Incorporated, Delaware)
Entity and address confirmed from incorporation documents and the
Shopify store address; phone stays hidden until a public number is set.
Plans now list the open items found in the live store instead.

Co-Authored-By: Claude Opus 5.5 <noreply@anthropic.com>
Claude-Session: https://claude.ai/code/session_01VLMDQvyzXwonaRACCHVmjk
</commit_message>
<xml_diff>
--- a/auracurate/docs/Aurora_About_기획서.docx
+++ b/auracurate/docs/Aurora_About_기획서.docx
@@ -602,7 +602,7 @@
                 <w:sz w:val="18"/>
                 <w:szCs w:val="18"/>
               </w:rPr>
-              <w:t xml:space="preserve">슬로건·소개문은 대표 확정(2026-10-03). 법인 정보는 확정 필요</w:t>
+              <w:t xml:space="preserve">슬로건·소개문은 대표 확정(2026-10-03). 미국 법인 확인 완료(2026-10-04): Asia Lab Global Incorporated, Delaware C Corporation</w:t>
             </w:r>
           </w:p>
         </w:tc>
@@ -3119,7 +3119,7 @@
                 <w:sz w:val="18"/>
                 <w:szCs w:val="18"/>
               </w:rPr>
-              <w:t xml:space="preserve">[미국 법인 정식 명칭 — 예: ○○ Inc. / ○○ LLC]</w:t>
+              <w:t xml:space="preserve">Asia Lab Global Incorporated (Delaware C Corporation, 2025-07-17 설립)</w:t>
             </w:r>
           </w:p>
         </w:tc>
@@ -3149,7 +3149,7 @@
                 <w:sz w:val="18"/>
                 <w:szCs w:val="18"/>
               </w:rPr>
-              <w:t xml:space="preserve">확정 필요</w:t>
+              <w:t xml:space="preserve">확인 완료 — 정관 표기 ASIA LAB GLOBAL INCORPORATED</w:t>
             </w:r>
           </w:p>
         </w:tc>
@@ -3212,7 +3212,7 @@
                 <w:sz w:val="18"/>
                 <w:szCs w:val="18"/>
               </w:rPr>
-              <w:t xml:space="preserve">[미국 주소 — 고객 문의·반품 안내와 일치]</w:t>
+              <w:t xml:space="preserve">254 Chapman Rd, Ste 208 #23693, Newark, DE 19702, USA</w:t>
             </w:r>
           </w:p>
         </w:tc>
@@ -3242,7 +3242,7 @@
                 <w:sz w:val="18"/>
                 <w:szCs w:val="18"/>
               </w:rPr>
-              <w:t xml:space="preserve">확정 필요</w:t>
+              <w:t xml:space="preserve">확인 완료 — Shopify 스토어 주소와 일치. 우편 대행(CMRA) 주소이므로 반품 수령 가능 여부 확인</w:t>
             </w:r>
           </w:p>
         </w:tc>
@@ -3398,7 +3398,7 @@
                 <w:sz w:val="18"/>
                 <w:szCs w:val="18"/>
               </w:rPr>
-              <w:t xml:space="preserve">[번호]</w:t>
+              <w:t xml:space="preserve">[공개용 번호]</w:t>
             </w:r>
           </w:p>
         </w:tc>
@@ -3428,7 +3428,7 @@
                 <w:sz w:val="18"/>
                 <w:szCs w:val="18"/>
               </w:rPr>
-              <w:t xml:space="preserve">확정 필요</w:t>
+              <w:t xml:space="preserve">확정 필요 — Shopify 스토어 전화 비어 있음</w:t>
             </w:r>
           </w:p>
         </w:tc>
@@ -4260,7 +4260,7 @@
                 <w:sz w:val="18"/>
                 <w:szCs w:val="18"/>
               </w:rPr>
-              <w:t xml:space="preserve">미국 법인 표기</w:t>
+              <w:t xml:space="preserve">고객 전화번호와 문의 이메일 통일</w:t>
             </w:r>
           </w:p>
         </w:tc>
@@ -4290,7 +4290,7 @@
                 <w:sz w:val="18"/>
                 <w:szCs w:val="18"/>
               </w:rPr>
-              <w:t xml:space="preserve">법인명·주소·전화 확정 후 About 하단과 푸터에 동일 표기</w:t>
+              <w:t xml:space="preserve">공개용 번호 1개 확정, 문의 이메일은 Shopify 값(global@asialab.world)과 사이트 값(aurora@auroracurate.com) 중 하나로 통일</w:t>
             </w:r>
           </w:p>
         </w:tc>

</xml_diff>

<commit_message>
Add global policy base set, per-item return terms and contact@ email
- content/policies.js: Terms, Refund, Shipping, Subscription, Contact
  information and Aurora Entities, written so 'we' is the Aurora entity
  named as seller; new entities are a data row in brand.legal.entities
- policy.html renders them; docs/policies holds Shopify-ready HTML
- PDP shows ships-from and return terms per item (metafield-ready),
  overriding policy defaults for dropshipped goods
- Customer email is now contact@auroracurate.com; phone is optional
- Plans updated with the multi-entity structure and per-item returns

Co-Authored-By: Claude Opus 5.5 <noreply@anthropic.com>
Claude-Session: https://claude.ai/code/session_01VLMDQvyzXwonaRACCHVmjk
</commit_message>
<xml_diff>
--- a/auracurate/docs/Aurora_About_기획서.docx
+++ b/auracurate/docs/Aurora_About_기획서.docx
@@ -3305,7 +3305,7 @@
                 <w:sz w:val="18"/>
                 <w:szCs w:val="18"/>
               </w:rPr>
-              <w:t xml:space="preserve">aurora@auroracurate.com</w:t>
+              <w:t xml:space="preserve">contact@auroracurate.com</w:t>
             </w:r>
           </w:p>
         </w:tc>
@@ -3335,7 +3335,7 @@
                 <w:sz w:val="18"/>
                 <w:szCs w:val="18"/>
               </w:rPr>
-              <w:t xml:space="preserve">운영 수신 확인 필요</w:t>
+              <w:t xml:space="preserve">확정 (2026-10-04)</w:t>
             </w:r>
           </w:p>
         </w:tc>
@@ -4290,7 +4290,7 @@
                 <w:sz w:val="18"/>
                 <w:szCs w:val="18"/>
               </w:rPr>
-              <w:t xml:space="preserve">공개용 번호 1개 확정, 문의 이메일은 Shopify 값(global@asialab.world)과 사이트 값(aurora@auroracurate.com) 중 하나로 통일</w:t>
+              <w:t xml:space="preserve">문의 이메일 contact@auroracurate.com 확정. 전화는 선택 — Shopify 스토어 이메일도 같은 주소로 변경</w:t>
             </w:r>
           </w:p>
         </w:tc>

</xml_diff>